<commit_message>
Build readout page and add combined score to the report
docs/eeg_readout.html shows, for each of the 180 held-out subjects, the
combined screening verdict, the five per-disorder probabilities with each
model's measured reliability, and where the subject sits among all
held-out scores. Built by readout/build.py from the results committed in
ee7d14a.
</commit_message>
<xml_diff>
--- a/docs/MiniProject_Results.docx
+++ b/docs/MiniProject_Results.docx
@@ -18,7 +18,7 @@
         <w:t xml:space="preserve">Results and architectures. </w:t>
       </w:r>
       <w:r>
-        <w:t>Mini Project I, Department of CSE, IIIT Nagpur, July-December 2026. Rajat Malik, Yash Khedekar, Abdul Malik, Ashwin Rathore. Supervisor: Dr. Nileshchandra Pikle. Generated 2026-09-13 from repository commit bf88adc.</w:t>
+        <w:t>Mini Project I, Department of CSE, IIIT Nagpur, July-December 2026. Rajat Malik, Yash Khedekar, Abdul Malik, Ashwin Rathore. Supervisor: Dr. Nileshchandra Pikle. Generated 2026-09-14 from repository commit ee7d14a.</w:t>
       </w:r>
     </w:p>
     <w:p>
@@ -59,6 +59,14 @@
       </w:pPr>
       <w:r>
         <w:t>The ensemble reaches balanced accuracy 0.235 [0.18, 0.29] over 6 classes (chance 0.167).</w:t>
+      </w:r>
+    </w:p>
+    <w:p>
+      <w:pPr>
+        <w:pStyle w:val="ListBullet"/>
+      </w:pPr>
+      <w:r>
+        <w:t>As a screen for 'outside the healthy range', the pre-declared combined score (mean of the five) reaches AUC 0.738 [0.59, 0.85]: it catches 70% of patients and wrongly flags 42% of healthy controls. Combining did not beat the single models.</w:t>
       </w:r>
     </w:p>
     <w:p>
@@ -7388,6 +7396,516 @@
           <w:sz w:val="16"/>
         </w:rPr>
         <w:t>Ensemble confusion matrix. Accuracy 0.289, balanced accuracy 0.235 [0.18, 0.29], majority-class rate 0.294, chance 0.167.</w:t>
+      </w:r>
+    </w:p>
+    <w:p/>
+    <w:p>
+      <w:pPr>
+        <w:pStyle w:val="Heading3"/>
+      </w:pPr>
+      <w:r>
+        <w:t>Outside the healthy range: combining the five models</w:t>
+      </w:r>
+    </w:p>
+    <w:p>
+      <w:r>
+        <w:t>Because every model detects illness but none names it, the display headline is a single score: the mean of the five calibrated probabilities, flagged at 0.5. This rule was fixed before the test split was scored for it; the maximum is reported only as a secondary check, so the test split was not used to choose between rules.</w:t>
+      </w:r>
+    </w:p>
+    <w:tbl>
+      <w:tblPr>
+        <w:tblStyle w:val="TableGrid"/>
+        <w:tblW w:type="auto" w:w="0"/>
+        <w:jc w:val="center"/>
+        <w:tblLook w:firstColumn="1" w:firstRow="1" w:lastColumn="0" w:lastRow="0" w:noHBand="0" w:noVBand="1" w:val="04A0"/>
+      </w:tblPr>
+      <w:tblGrid>
+        <w:gridCol w:w="2160"/>
+        <w:gridCol w:w="2160"/>
+        <w:gridCol w:w="2160"/>
+        <w:gridCol w:w="2160"/>
+      </w:tblGrid>
+      <w:tr>
+        <w:tc>
+          <w:tcPr>
+            <w:tcW w:type="dxa" w:w="2592"/>
+            <w:shd w:val="clear" w:color="auto" w:fill="eef3fb"/>
+          </w:tcPr>
+          <w:p>
+            <w:r/>
+            <w:r>
+              <w:rPr>
+                <w:b/>
+                <w:sz w:val="17"/>
+              </w:rPr>
+              <w:t>score</w:t>
+            </w:r>
+          </w:p>
+        </w:tc>
+        <w:tc>
+          <w:tcPr>
+            <w:tcW w:type="dxa" w:w="3456"/>
+            <w:shd w:val="clear" w:color="auto" w:fill="eef3fb"/>
+          </w:tcPr>
+          <w:p>
+            <w:r/>
+            <w:r>
+              <w:rPr>
+                <w:b/>
+                <w:sz w:val="17"/>
+              </w:rPr>
+              <w:t>AUC any patient vs healthy [95% CI]</w:t>
+            </w:r>
+          </w:p>
+        </w:tc>
+        <w:tc>
+          <w:tcPr>
+            <w:tcW w:type="dxa" w:w="1584"/>
+            <w:shd w:val="clear" w:color="auto" w:fill="eef3fb"/>
+          </w:tcPr>
+          <w:p>
+            <w:r/>
+            <w:r>
+              <w:rPr>
+                <w:b/>
+                <w:sz w:val="17"/>
+              </w:rPr>
+              <w:t>sensitivity at 0.5</w:t>
+            </w:r>
+          </w:p>
+        </w:tc>
+        <w:tc>
+          <w:tcPr>
+            <w:tcW w:type="dxa" w:w="1584"/>
+            <w:shd w:val="clear" w:color="auto" w:fill="eef3fb"/>
+          </w:tcPr>
+          <w:p>
+            <w:r/>
+            <w:r>
+              <w:rPr>
+                <w:b/>
+                <w:sz w:val="17"/>
+              </w:rPr>
+              <w:t>specificity at 0.5</w:t>
+            </w:r>
+          </w:p>
+        </w:tc>
+      </w:tr>
+      <w:tr>
+        <w:tc>
+          <w:tcPr>
+            <w:tcW w:type="dxa" w:w="2592"/>
+          </w:tcPr>
+          <w:p>
+            <w:r/>
+            <w:r>
+              <w:rPr>
+                <w:sz w:val="17"/>
+              </w:rPr>
+              <w:t>combined, mean</w:t>
+            </w:r>
+          </w:p>
+        </w:tc>
+        <w:tc>
+          <w:tcPr>
+            <w:tcW w:type="dxa" w:w="3456"/>
+          </w:tcPr>
+          <w:p>
+            <w:r/>
+            <w:r>
+              <w:rPr>
+                <w:sz w:val="17"/>
+              </w:rPr>
+              <w:t>0.738 [0.59, 0.85]</w:t>
+            </w:r>
+          </w:p>
+        </w:tc>
+        <w:tc>
+          <w:tcPr>
+            <w:tcW w:type="dxa" w:w="1584"/>
+          </w:tcPr>
+          <w:p>
+            <w:r/>
+            <w:r>
+              <w:rPr>
+                <w:sz w:val="17"/>
+              </w:rPr>
+              <w:t>0.70</w:t>
+            </w:r>
+          </w:p>
+        </w:tc>
+        <w:tc>
+          <w:tcPr>
+            <w:tcW w:type="dxa" w:w="1584"/>
+          </w:tcPr>
+          <w:p>
+            <w:r/>
+            <w:r>
+              <w:rPr>
+                <w:sz w:val="17"/>
+              </w:rPr>
+              <w:t>0.58</w:t>
+            </w:r>
+          </w:p>
+        </w:tc>
+      </w:tr>
+      <w:tr>
+        <w:tc>
+          <w:tcPr>
+            <w:tcW w:type="dxa" w:w="2592"/>
+          </w:tcPr>
+          <w:p>
+            <w:r/>
+            <w:r>
+              <w:rPr>
+                <w:sz w:val="17"/>
+              </w:rPr>
+              <w:t>combined, max (secondary)</w:t>
+            </w:r>
+          </w:p>
+        </w:tc>
+        <w:tc>
+          <w:tcPr>
+            <w:tcW w:type="dxa" w:w="3456"/>
+          </w:tcPr>
+          <w:p>
+            <w:r/>
+            <w:r>
+              <w:rPr>
+                <w:sz w:val="17"/>
+              </w:rPr>
+              <w:t>0.696 [0.52, 0.84]</w:t>
+            </w:r>
+          </w:p>
+        </w:tc>
+        <w:tc>
+          <w:tcPr>
+            <w:tcW w:type="dxa" w:w="1584"/>
+          </w:tcPr>
+          <w:p>
+            <w:r/>
+            <w:r>
+              <w:rPr>
+                <w:sz w:val="17"/>
+              </w:rPr>
+              <w:t>0.92</w:t>
+            </w:r>
+          </w:p>
+        </w:tc>
+        <w:tc>
+          <w:tcPr>
+            <w:tcW w:type="dxa" w:w="1584"/>
+          </w:tcPr>
+          <w:p>
+            <w:r/>
+            <w:r>
+              <w:rPr>
+                <w:sz w:val="17"/>
+              </w:rPr>
+              <w:t>0.37</w:t>
+            </w:r>
+          </w:p>
+        </w:tc>
+      </w:tr>
+      <w:tr>
+        <w:tc>
+          <w:tcPr>
+            <w:tcW w:type="dxa" w:w="2592"/>
+          </w:tcPr>
+          <w:p>
+            <w:r/>
+            <w:r>
+              <w:rPr>
+                <w:sz w:val="17"/>
+              </w:rPr>
+              <w:t>single schizophrenia model</w:t>
+            </w:r>
+          </w:p>
+        </w:tc>
+        <w:tc>
+          <w:tcPr>
+            <w:tcW w:type="dxa" w:w="3456"/>
+          </w:tcPr>
+          <w:p>
+            <w:r/>
+            <w:r>
+              <w:rPr>
+                <w:sz w:val="17"/>
+              </w:rPr>
+              <w:t>0.697 [0.53, 0.83]</w:t>
+            </w:r>
+          </w:p>
+        </w:tc>
+        <w:tc>
+          <w:tcPr>
+            <w:tcW w:type="dxa" w:w="1584"/>
+          </w:tcPr>
+          <w:p>
+            <w:r/>
+            <w:r>
+              <w:rPr>
+                <w:sz w:val="17"/>
+              </w:rPr>
+              <w:t>-</w:t>
+            </w:r>
+          </w:p>
+        </w:tc>
+        <w:tc>
+          <w:tcPr>
+            <w:tcW w:type="dxa" w:w="1584"/>
+          </w:tcPr>
+          <w:p>
+            <w:r/>
+            <w:r>
+              <w:rPr>
+                <w:sz w:val="17"/>
+              </w:rPr>
+              <w:t>-</w:t>
+            </w:r>
+          </w:p>
+        </w:tc>
+      </w:tr>
+      <w:tr>
+        <w:tc>
+          <w:tcPr>
+            <w:tcW w:type="dxa" w:w="2592"/>
+          </w:tcPr>
+          <w:p>
+            <w:r/>
+            <w:r>
+              <w:rPr>
+                <w:sz w:val="17"/>
+              </w:rPr>
+              <w:t>single mood model</w:t>
+            </w:r>
+          </w:p>
+        </w:tc>
+        <w:tc>
+          <w:tcPr>
+            <w:tcW w:type="dxa" w:w="3456"/>
+          </w:tcPr>
+          <w:p>
+            <w:r/>
+            <w:r>
+              <w:rPr>
+                <w:sz w:val="17"/>
+              </w:rPr>
+              <w:t>0.702 [0.53, 0.85]</w:t>
+            </w:r>
+          </w:p>
+        </w:tc>
+        <w:tc>
+          <w:tcPr>
+            <w:tcW w:type="dxa" w:w="1584"/>
+          </w:tcPr>
+          <w:p>
+            <w:r/>
+            <w:r>
+              <w:rPr>
+                <w:sz w:val="17"/>
+              </w:rPr>
+              <w:t>-</w:t>
+            </w:r>
+          </w:p>
+        </w:tc>
+        <w:tc>
+          <w:tcPr>
+            <w:tcW w:type="dxa" w:w="1584"/>
+          </w:tcPr>
+          <w:p>
+            <w:r/>
+            <w:r>
+              <w:rPr>
+                <w:sz w:val="17"/>
+              </w:rPr>
+              <w:t>-</w:t>
+            </w:r>
+          </w:p>
+        </w:tc>
+      </w:tr>
+      <w:tr>
+        <w:tc>
+          <w:tcPr>
+            <w:tcW w:type="dxa" w:w="2592"/>
+          </w:tcPr>
+          <w:p>
+            <w:r/>
+            <w:r>
+              <w:rPr>
+                <w:sz w:val="17"/>
+              </w:rPr>
+              <w:t>single addictive model</w:t>
+            </w:r>
+          </w:p>
+        </w:tc>
+        <w:tc>
+          <w:tcPr>
+            <w:tcW w:type="dxa" w:w="3456"/>
+          </w:tcPr>
+          <w:p>
+            <w:r/>
+            <w:r>
+              <w:rPr>
+                <w:sz w:val="17"/>
+              </w:rPr>
+              <w:t>0.631 [0.48, 0.77]</w:t>
+            </w:r>
+          </w:p>
+        </w:tc>
+        <w:tc>
+          <w:tcPr>
+            <w:tcW w:type="dxa" w:w="1584"/>
+          </w:tcPr>
+          <w:p>
+            <w:r/>
+            <w:r>
+              <w:rPr>
+                <w:sz w:val="17"/>
+              </w:rPr>
+              <w:t>-</w:t>
+            </w:r>
+          </w:p>
+        </w:tc>
+        <w:tc>
+          <w:tcPr>
+            <w:tcW w:type="dxa" w:w="1584"/>
+          </w:tcPr>
+          <w:p>
+            <w:r/>
+            <w:r>
+              <w:rPr>
+                <w:sz w:val="17"/>
+              </w:rPr>
+              <w:t>-</w:t>
+            </w:r>
+          </w:p>
+        </w:tc>
+      </w:tr>
+      <w:tr>
+        <w:tc>
+          <w:tcPr>
+            <w:tcW w:type="dxa" w:w="2592"/>
+          </w:tcPr>
+          <w:p>
+            <w:r/>
+            <w:r>
+              <w:rPr>
+                <w:sz w:val="17"/>
+              </w:rPr>
+              <w:t>single trauma model</w:t>
+            </w:r>
+          </w:p>
+        </w:tc>
+        <w:tc>
+          <w:tcPr>
+            <w:tcW w:type="dxa" w:w="3456"/>
+          </w:tcPr>
+          <w:p>
+            <w:r/>
+            <w:r>
+              <w:rPr>
+                <w:sz w:val="17"/>
+              </w:rPr>
+              <w:t>0.719 [0.57, 0.84]</w:t>
+            </w:r>
+          </w:p>
+        </w:tc>
+        <w:tc>
+          <w:tcPr>
+            <w:tcW w:type="dxa" w:w="1584"/>
+          </w:tcPr>
+          <w:p>
+            <w:r/>
+            <w:r>
+              <w:rPr>
+                <w:sz w:val="17"/>
+              </w:rPr>
+              <w:t>-</w:t>
+            </w:r>
+          </w:p>
+        </w:tc>
+        <w:tc>
+          <w:tcPr>
+            <w:tcW w:type="dxa" w:w="1584"/>
+          </w:tcPr>
+          <w:p>
+            <w:r/>
+            <w:r>
+              <w:rPr>
+                <w:sz w:val="17"/>
+              </w:rPr>
+              <w:t>-</w:t>
+            </w:r>
+          </w:p>
+        </w:tc>
+      </w:tr>
+      <w:tr>
+        <w:tc>
+          <w:tcPr>
+            <w:tcW w:type="dxa" w:w="2592"/>
+          </w:tcPr>
+          <w:p>
+            <w:r/>
+            <w:r>
+              <w:rPr>
+                <w:sz w:val="17"/>
+              </w:rPr>
+              <w:t>single anxiety model</w:t>
+            </w:r>
+          </w:p>
+        </w:tc>
+        <w:tc>
+          <w:tcPr>
+            <w:tcW w:type="dxa" w:w="3456"/>
+          </w:tcPr>
+          <w:p>
+            <w:r/>
+            <w:r>
+              <w:rPr>
+                <w:sz w:val="17"/>
+              </w:rPr>
+              <w:t>0.792 [0.67, 0.89]</w:t>
+            </w:r>
+          </w:p>
+        </w:tc>
+        <w:tc>
+          <w:tcPr>
+            <w:tcW w:type="dxa" w:w="1584"/>
+          </w:tcPr>
+          <w:p>
+            <w:r/>
+            <w:r>
+              <w:rPr>
+                <w:sz w:val="17"/>
+              </w:rPr>
+              <w:t>-</w:t>
+            </w:r>
+          </w:p>
+        </w:tc>
+        <w:tc>
+          <w:tcPr>
+            <w:tcW w:type="dxa" w:w="1584"/>
+          </w:tcPr>
+          <w:p>
+            <w:r/>
+            <w:r>
+              <w:rPr>
+                <w:sz w:val="17"/>
+              </w:rPr>
+              <w:t>-</w:t>
+            </w:r>
+          </w:p>
+        </w:tc>
+      </w:tr>
+    </w:tbl>
+    <w:p>
+      <w:r>
+        <w:rPr>
+          <w:i/>
+          <w:color w:val="52514E"/>
+          <w:sz w:val="16"/>
+        </w:rPr>
+        <w:t>Combining did not measurably help: the mean (0.738) sits inside the range of the single models, and the anxiety model alone scored higher. With 19 healthy controls none of these differences is resolvable, and switching the headline to the best single model after seeing these numbers would be test-set selection. At 0.5 the flag catches 70% of patients and wrongly flags 42% of healthy controls.</w:t>
       </w:r>
     </w:p>
     <w:p/>

</xml_diff>

<commit_message>
Rebuild report and readout page with neurological results
Report gains section 5.5 (Alzheimer's, FTD, Parkinson's), figure 9, the
blink check computed from per-group rejection rates, and neurological
summary lines whose wording is decided by each confidence interval.
The readout page gains a neurological panel kept separate from the
psychiatric models. Both built from the results committed in ce0e61d.
</commit_message>
<xml_diff>
--- a/docs/MiniProject_Results.docx
+++ b/docs/MiniProject_Results.docx
@@ -7,7 +7,7 @@
         <w:pStyle w:val="Title"/>
       </w:pPr>
       <w:r>
-        <w:t>Brain Signal Processing: EEG + Graph Neural Networks for Psychiatric Disorder Classification</w:t>
+        <w:t>Brain Signal Processing: EEG + Graph Neural Networks for Brain Disorder Classification</w:t>
       </w:r>
     </w:p>
     <w:p>
@@ -18,7 +18,7 @@
         <w:t xml:space="preserve">Results and architectures. </w:t>
       </w:r>
       <w:r>
-        <w:t>Mini Project I, Department of CSE, IIIT Nagpur, July-December 2026. Rajat Malik, Yash Khedekar, Abdul Malik, Ashwin Rathore. Supervisor: Dr. Nileshchandra Pikle. Generated 2026-09-14 from repository commit ee7d14a.</w:t>
+        <w:t>Mini Project I, Department of CSE, IIIT Nagpur, July-December 2026. Rajat Malik, Yash Khedekar, Abdul Malik, Ashwin Rathore. Supervisor: Dr. Nileshchandra Pikle. Generated 2026-09-14 from repository commit ce0e61d.</w:t>
       </w:r>
     </w:p>
     <w:p>
@@ -82,7 +82,7 @@
         <w:pStyle w:val="ListBullet"/>
       </w:pPr>
       <w:r>
-        <w:t>On raw EEG from two independent hospitals, the same GNN (not re-tuned) detects schizophrenia within each hospital (AUC 0.77 ASEEG, 0.77 Warsaw; pooled 0.75), but a model trained at one hospital is at chance at the other (AUC 0.53 and 0.51). What is learned is largely hospital-specific: the disease signature, as captured by these features, does not transfer across sites.</w:t>
+        <w:t>On raw EEG from two independent hospitals, the same GNN (not re-tuned) detects schizophrenia within each hospital (AUC 0.77 ASEEG, 0.77 Warsaw; pooled 0.75), but a model trained at one hospital is at chance at the other (AUC 0.53 and 0.51). For schizophrenia, what is learned is largely hospital-specific: the signature, as captured by these features, does not transfer across sites.</w:t>
       </w:r>
     </w:p>
     <w:p>
@@ -91,6 +91,54 @@
       </w:pPr>
       <w:r>
         <w:t>Depression within Mumtaz reaches AUC 0.95, but with no second open dataset it cannot be checked across hospitals, and the schizophrenia transfer result means a single-site score should not be read as a transferable disease signature.</w:t>
+      </w:r>
+    </w:p>
+    <w:p>
+      <w:pPr>
+        <w:pStyle w:val="ListBullet"/>
+      </w:pPr>
+      <w:r>
+        <w:t>Alzheimer's disease vs healthy controls (Thessaloniki, same GNN, not re-tuned): AUC 0.89 [0.80, 0.97], above chance.</w:t>
+      </w:r>
+    </w:p>
+    <w:p>
+      <w:pPr>
+        <w:pStyle w:val="ListBullet"/>
+      </w:pPr>
+      <w:r>
+        <w:t>Frontotemporal dementia vs healthy controls (same hospital): AUC 0.79 [0.64, 0.92], above chance.</w:t>
+      </w:r>
+    </w:p>
+    <w:p>
+      <w:pPr>
+        <w:pStyle w:val="ListBullet"/>
+      </w:pPr>
+      <w:r>
+        <w:t>Telling Alzheimer's from frontotemporal dementia - the only between-disease test that is fair, because both groups come from one hospital: AUC 0.63 [0.49, 0.77], not distinguishable from chance.</w:t>
+      </w:r>
+    </w:p>
+    <w:p>
+      <w:pPr>
+        <w:pStyle w:val="ListBullet"/>
+      </w:pPr>
+      <w:r>
+        <w:t>Parkinson's disease vs healthy controls within each hospital: Iowa AUC 0.58 [0.48, 0.68], not distinguishable from chance; New Mexico AUC 0.70 [0.53, 0.85], above chance; San Diego AUC 0.67 [0.46, 0.85], not distinguishable from chance.</w:t>
+      </w:r>
+    </w:p>
+    <w:p>
+      <w:pPr>
+        <w:pStyle w:val="ListBullet"/>
+      </w:pPr>
+      <w:r>
+        <w:t>Parkinson's trained on the other hospitals and tested on one never seen: Iowa AUC 0.68 [0.58, 0.78], above chance; New Mexico AUC 0.74 [0.56, 0.88], above chance; San Diego AUC 0.78 [0.59, 0.94], above chance.</w:t>
+      </w:r>
+    </w:p>
+    <w:p>
+      <w:pPr>
+        <w:pStyle w:val="ListBullet"/>
+      </w:pPr>
+      <w:r>
+        <w:t>Unlike schizophrenia, whose models fell to chance at an unseen hospital, the Parkinson's models stay above chance at every hospital they never saw - the first result here that transfers across sites. See the blink caveat in section 5.5 before reading it as a purely cortical signature.</w:t>
       </w:r>
     </w:p>
     <w:p>
@@ -553,6 +601,294 @@
                 <w:sz w:val="17"/>
               </w:rPr>
               <w:t>raw depression track</w:t>
+            </w:r>
+          </w:p>
+        </w:tc>
+      </w:tr>
+      <w:tr>
+        <w:tc>
+          <w:tcPr>
+            <w:tcW w:type="dxa" w:w="2016"/>
+          </w:tcPr>
+          <w:p>
+            <w:r/>
+            <w:r>
+              <w:rPr>
+                <w:sz w:val="17"/>
+              </w:rPr>
+              <w:t>ds004504 (Miltiadous 2023)</w:t>
+            </w:r>
+          </w:p>
+        </w:tc>
+        <w:tc>
+          <w:tcPr>
+            <w:tcW w:type="dxa" w:w="2160"/>
+          </w:tcPr>
+          <w:p>
+            <w:r/>
+            <w:r>
+              <w:rPr>
+                <w:sz w:val="17"/>
+              </w:rPr>
+              <w:t>OpenNeuro, CC0, Thessaloniki</w:t>
+            </w:r>
+          </w:p>
+        </w:tc>
+        <w:tc>
+          <w:tcPr>
+            <w:tcW w:type="dxa" w:w="1872"/>
+          </w:tcPr>
+          <w:p>
+            <w:r/>
+            <w:r>
+              <w:rPr>
+                <w:sz w:val="17"/>
+              </w:rPr>
+              <w:t>36 AD / 23 FTD / 29 controls</w:t>
+            </w:r>
+          </w:p>
+        </w:tc>
+        <w:tc>
+          <w:tcPr>
+            <w:tcW w:type="dxa" w:w="1872"/>
+          </w:tcPr>
+          <w:p>
+            <w:r/>
+            <w:r>
+              <w:rPr>
+                <w:sz w:val="17"/>
+              </w:rPr>
+              <w:t>19-ch raw, eyes closed</w:t>
+            </w:r>
+          </w:p>
+        </w:tc>
+        <w:tc>
+          <w:tcPr>
+            <w:tcW w:type="dxa" w:w="1440"/>
+          </w:tcPr>
+          <w:p>
+            <w:r/>
+            <w:r>
+              <w:rPr>
+                <w:sz w:val="17"/>
+              </w:rPr>
+              <w:t>AD / FTD track</w:t>
+            </w:r>
+          </w:p>
+        </w:tc>
+      </w:tr>
+      <w:tr>
+        <w:tc>
+          <w:tcPr>
+            <w:tcW w:type="dxa" w:w="2016"/>
+          </w:tcPr>
+          <w:p>
+            <w:r/>
+            <w:r>
+              <w:rPr>
+                <w:sz w:val="17"/>
+              </w:rPr>
+              <w:t>ds004584</w:t>
+            </w:r>
+          </w:p>
+        </w:tc>
+        <w:tc>
+          <w:tcPr>
+            <w:tcW w:type="dxa" w:w="2160"/>
+          </w:tcPr>
+          <w:p>
+            <w:r/>
+            <w:r>
+              <w:rPr>
+                <w:sz w:val="17"/>
+              </w:rPr>
+              <w:t>OpenNeuro, CC0, Iowa</w:t>
+            </w:r>
+          </w:p>
+        </w:tc>
+        <w:tc>
+          <w:tcPr>
+            <w:tcW w:type="dxa" w:w="1872"/>
+          </w:tcPr>
+          <w:p>
+            <w:r/>
+            <w:r>
+              <w:rPr>
+                <w:sz w:val="17"/>
+              </w:rPr>
+              <w:t>100 PD / 49 controls</w:t>
+            </w:r>
+          </w:p>
+        </w:tc>
+        <w:tc>
+          <w:tcPr>
+            <w:tcW w:type="dxa" w:w="1872"/>
+          </w:tcPr>
+          <w:p>
+            <w:r/>
+            <w:r>
+              <w:rPr>
+                <w:sz w:val="17"/>
+              </w:rPr>
+              <w:t>63-ch, eyes open, Pz reference</w:t>
+            </w:r>
+          </w:p>
+        </w:tc>
+        <w:tc>
+          <w:tcPr>
+            <w:tcW w:type="dxa" w:w="1440"/>
+          </w:tcPr>
+          <w:p>
+            <w:r/>
+            <w:r>
+              <w:rPr>
+                <w:sz w:val="17"/>
+              </w:rPr>
+              <w:t>PD track</w:t>
+            </w:r>
+          </w:p>
+        </w:tc>
+      </w:tr>
+      <w:tr>
+        <w:tc>
+          <w:tcPr>
+            <w:tcW w:type="dxa" w:w="2016"/>
+          </w:tcPr>
+          <w:p>
+            <w:r/>
+            <w:r>
+              <w:rPr>
+                <w:sz w:val="17"/>
+              </w:rPr>
+              <w:t>ds003490</w:t>
+            </w:r>
+          </w:p>
+        </w:tc>
+        <w:tc>
+          <w:tcPr>
+            <w:tcW w:type="dxa" w:w="2160"/>
+          </w:tcPr>
+          <w:p>
+            <w:r/>
+            <w:r>
+              <w:rPr>
+                <w:sz w:val="17"/>
+              </w:rPr>
+              <w:t>OpenNeuro, CC0, New Mexico</w:t>
+            </w:r>
+          </w:p>
+        </w:tc>
+        <w:tc>
+          <w:tcPr>
+            <w:tcW w:type="dxa" w:w="1872"/>
+          </w:tcPr>
+          <w:p>
+            <w:r/>
+            <w:r>
+              <w:rPr>
+                <w:sz w:val="17"/>
+              </w:rPr>
+              <w:t>25 PD / 25 controls</w:t>
+            </w:r>
+          </w:p>
+        </w:tc>
+        <w:tc>
+          <w:tcPr>
+            <w:tcW w:type="dxa" w:w="1872"/>
+          </w:tcPr>
+          <w:p>
+            <w:r/>
+            <w:r>
+              <w:rPr>
+                <w:sz w:val="17"/>
+              </w:rPr>
+              <w:t>64-ch, eyes-open minute, OFF meds</w:t>
+            </w:r>
+          </w:p>
+        </w:tc>
+        <w:tc>
+          <w:tcPr>
+            <w:tcW w:type="dxa" w:w="1440"/>
+          </w:tcPr>
+          <w:p>
+            <w:r/>
+            <w:r>
+              <w:rPr>
+                <w:sz w:val="17"/>
+              </w:rPr>
+              <w:t>PD track</w:t>
+            </w:r>
+          </w:p>
+        </w:tc>
+      </w:tr>
+      <w:tr>
+        <w:tc>
+          <w:tcPr>
+            <w:tcW w:type="dxa" w:w="2016"/>
+          </w:tcPr>
+          <w:p>
+            <w:r/>
+            <w:r>
+              <w:rPr>
+                <w:sz w:val="17"/>
+              </w:rPr>
+              <w:t>ds002778</w:t>
+            </w:r>
+          </w:p>
+        </w:tc>
+        <w:tc>
+          <w:tcPr>
+            <w:tcW w:type="dxa" w:w="2160"/>
+          </w:tcPr>
+          <w:p>
+            <w:r/>
+            <w:r>
+              <w:rPr>
+                <w:sz w:val="17"/>
+              </w:rPr>
+              <w:t>OpenNeuro, CC0, San Diego</w:t>
+            </w:r>
+          </w:p>
+        </w:tc>
+        <w:tc>
+          <w:tcPr>
+            <w:tcW w:type="dxa" w:w="1872"/>
+          </w:tcPr>
+          <w:p>
+            <w:r/>
+            <w:r>
+              <w:rPr>
+                <w:sz w:val="17"/>
+              </w:rPr>
+              <w:t>15 PD / 16 controls</w:t>
+            </w:r>
+          </w:p>
+        </w:tc>
+        <w:tc>
+          <w:tcPr>
+            <w:tcW w:type="dxa" w:w="1872"/>
+          </w:tcPr>
+          <w:p>
+            <w:r/>
+            <w:r>
+              <w:rPr>
+                <w:sz w:val="17"/>
+              </w:rPr>
+              <w:t>32-ch BioSemi, eyes open, OFF meds</w:t>
+            </w:r>
+          </w:p>
+        </w:tc>
+        <w:tc>
+          <w:tcPr>
+            <w:tcW w:type="dxa" w:w="1440"/>
+          </w:tcPr>
+          <w:p>
+            <w:r/>
+            <w:r>
+              <w:rPr>
+                <w:sz w:val="17"/>
+              </w:rPr>
+              <w:t>PD track</w:t>
             </w:r>
           </w:p>
         </w:tc>
@@ -8071,7 +8407,7 @@
               <w:rPr>
                 <w:sz w:val="17"/>
               </w:rPr>
-              <w:t>aseeg</w:t>
+              <w:t>ASEEG</w:t>
             </w:r>
           </w:p>
         </w:tc>
@@ -8085,7 +8421,7 @@
               <w:rPr>
                 <w:sz w:val="17"/>
               </w:rPr>
-              <w:t>controls</w:t>
+              <w:t>control</w:t>
             </w:r>
           </w:p>
         </w:tc>
@@ -8143,7 +8479,7 @@
               <w:rPr>
                 <w:sz w:val="17"/>
               </w:rPr>
-              <w:t>aseeg</w:t>
+              <w:t>ASEEG</w:t>
             </w:r>
           </w:p>
         </w:tc>
@@ -8157,7 +8493,7 @@
               <w:rPr>
                 <w:sz w:val="17"/>
               </w:rPr>
-              <w:t>patients</w:t>
+              <w:t>schizophrenia</w:t>
             </w:r>
           </w:p>
         </w:tc>
@@ -8215,7 +8551,7 @@
               <w:rPr>
                 <w:sz w:val="17"/>
               </w:rPr>
-              <w:t>warsaw</w:t>
+              <w:t>Warsaw</w:t>
             </w:r>
           </w:p>
         </w:tc>
@@ -8229,7 +8565,7 @@
               <w:rPr>
                 <w:sz w:val="17"/>
               </w:rPr>
-              <w:t>controls</w:t>
+              <w:t>control</w:t>
             </w:r>
           </w:p>
         </w:tc>
@@ -8287,7 +8623,7 @@
               <w:rPr>
                 <w:sz w:val="17"/>
               </w:rPr>
-              <w:t>warsaw</w:t>
+              <w:t>Warsaw</w:t>
             </w:r>
           </w:p>
         </w:tc>
@@ -8301,7 +8637,7 @@
               <w:rPr>
                 <w:sz w:val="17"/>
               </w:rPr>
-              <w:t>patients</w:t>
+              <w:t>schizophrenia</w:t>
             </w:r>
           </w:p>
         </w:tc>
@@ -8359,7 +8695,7 @@
               <w:rPr>
                 <w:sz w:val="17"/>
               </w:rPr>
-              <w:t>mumtaz</w:t>
+              <w:t>Mumtaz</w:t>
             </w:r>
           </w:p>
         </w:tc>
@@ -8373,7 +8709,7 @@
               <w:rPr>
                 <w:sz w:val="17"/>
               </w:rPr>
-              <w:t>controls</w:t>
+              <w:t>control</w:t>
             </w:r>
           </w:p>
         </w:tc>
@@ -8431,7 +8767,7 @@
               <w:rPr>
                 <w:sz w:val="17"/>
               </w:rPr>
-              <w:t>mumtaz</w:t>
+              <w:t>Mumtaz</w:t>
             </w:r>
           </w:p>
         </w:tc>
@@ -8445,7 +8781,7 @@
               <w:rPr>
                 <w:sz w:val="17"/>
               </w:rPr>
-              <w:t>patients</w:t>
+              <w:t>mood</w:t>
             </w:r>
           </w:p>
         </w:tc>
@@ -8613,7 +8949,7 @@
                 <w:b/>
                 <w:sz w:val="17"/>
               </w:rPr>
-              <w:t>patients</w:t>
+              <w:t>positive</w:t>
             </w:r>
           </w:p>
         </w:tc>
@@ -8629,7 +8965,7 @@
                 <w:b/>
                 <w:sz w:val="17"/>
               </w:rPr>
-              <w:t>controls</w:t>
+              <w:t>negative</w:t>
             </w:r>
           </w:p>
         </w:tc>
@@ -8761,7 +9097,7 @@
               <w:rPr>
                 <w:sz w:val="17"/>
               </w:rPr>
-              <w:t>SZ: pooled (both hospitals)</w:t>
+              <w:t>SZ: pooled (2 hospitals)</w:t>
             </w:r>
           </w:p>
         </w:tc>
@@ -9099,6 +9435,2056 @@
         </w:tc>
       </w:tr>
     </w:tbl>
+    <w:p/>
+    <w:p>
+      <w:pPr>
+        <w:pStyle w:val="Heading2"/>
+      </w:pPr>
+      <w:r>
+        <w:t>5.5 Neurological disorders</w:t>
+      </w:r>
+    </w:p>
+    <w:p>
+      <w:r>
+        <w:t>Alzheimer's disease, frontotemporal dementia and Parkinson's disease come from separate open datasets, each with its own healthy controls, run through the same pipeline and the same GNN configuration (tuned on Park, not re-tuned). They are kept apart from the psychiatric models: different hospitals, older patients, and in the Parkinson's datasets eyes-open recordings, so their probabilities are not comparable with the psychiatric ones, and no model is ever asked to choose between a disease from one hospital and a disease from another. The one between-disease test is Alzheimer's vs frontotemporal dementia, which is fair because both come from the same hospital and the same protocol.</w:t>
+      </w:r>
+    </w:p>
+    <w:p>
+      <w:pPr>
+        <w:pStyle w:val="ListBullet"/>
+      </w:pPr>
+      <w:r>
+        <w:t>Parkinson's patients: the OFF-medication session where a dataset offers both (New Mexico, San Diego); Iowa does not state medication state.</w:t>
+      </w:r>
+    </w:p>
+    <w:p>
+      <w:pPr>
+        <w:pStyle w:val="ListBullet"/>
+      </w:pPr>
+      <w:r>
+        <w:t>Iowa records against Pz, one of the 19 electrodes; Pz enters as zeros and the average reference reconstructs it exactly.</w:t>
+      </w:r>
+    </w:p>
+    <w:p>
+      <w:pPr>
+        <w:pStyle w:val="ListBullet"/>
+      </w:pPr>
+      <w:r>
+        <w:t>New Mexico recordings interleave instructed eyes-open and eyes-closed minutes; only the eyes-open minute is used, to match the other two Parkinson's sites.</w:t>
+      </w:r>
+    </w:p>
+    <w:p>
+      <w:pPr>
+        <w:pStyle w:val="ListBullet"/>
+      </w:pPr>
+      <w:r>
+        <w:t>Mains notch at 50 Hz (Thessaloniki) or 60 Hz (the three US sites).</w:t>
+      </w:r>
+    </w:p>
+    <w:tbl>
+      <w:tblPr>
+        <w:tblStyle w:val="TableGrid"/>
+        <w:tblW w:type="auto" w:w="0"/>
+        <w:jc w:val="center"/>
+        <w:tblLook w:firstColumn="1" w:firstRow="1" w:lastColumn="0" w:lastRow="0" w:noHBand="0" w:noVBand="1" w:val="04A0"/>
+      </w:tblPr>
+      <w:tblGrid>
+        <w:gridCol w:w="1728"/>
+        <w:gridCol w:w="1728"/>
+        <w:gridCol w:w="1728"/>
+        <w:gridCol w:w="1728"/>
+        <w:gridCol w:w="1728"/>
+      </w:tblGrid>
+      <w:tr>
+        <w:tc>
+          <w:tcPr>
+            <w:tcW w:type="dxa" w:w="1728"/>
+            <w:shd w:val="clear" w:color="auto" w:fill="eef3fb"/>
+          </w:tcPr>
+          <w:p>
+            <w:r/>
+            <w:r>
+              <w:rPr>
+                <w:b/>
+                <w:sz w:val="17"/>
+              </w:rPr>
+              <w:t>dataset</w:t>
+            </w:r>
+          </w:p>
+        </w:tc>
+        <w:tc>
+          <w:tcPr>
+            <w:tcW w:type="dxa" w:w="1728"/>
+            <w:shd w:val="clear" w:color="auto" w:fill="eef3fb"/>
+          </w:tcPr>
+          <w:p>
+            <w:r/>
+            <w:r>
+              <w:rPr>
+                <w:b/>
+                <w:sz w:val="17"/>
+              </w:rPr>
+              <w:t>group</w:t>
+            </w:r>
+          </w:p>
+        </w:tc>
+        <w:tc>
+          <w:tcPr>
+            <w:tcW w:type="dxa" w:w="1728"/>
+            <w:shd w:val="clear" w:color="auto" w:fill="eef3fb"/>
+          </w:tcPr>
+          <w:p>
+            <w:r/>
+            <w:r>
+              <w:rPr>
+                <w:b/>
+                <w:sz w:val="17"/>
+              </w:rPr>
+              <w:t>subjects</w:t>
+            </w:r>
+          </w:p>
+        </w:tc>
+        <w:tc>
+          <w:tcPr>
+            <w:tcW w:type="dxa" w:w="1728"/>
+            <w:shd w:val="clear" w:color="auto" w:fill="eef3fb"/>
+          </w:tcPr>
+          <w:p>
+            <w:r/>
+            <w:r>
+              <w:rPr>
+                <w:b/>
+                <w:sz w:val="17"/>
+              </w:rPr>
+              <w:t>windows kept</w:t>
+            </w:r>
+          </w:p>
+        </w:tc>
+        <w:tc>
+          <w:tcPr>
+            <w:tcW w:type="dxa" w:w="1728"/>
+            <w:shd w:val="clear" w:color="auto" w:fill="eef3fb"/>
+          </w:tcPr>
+          <w:p>
+            <w:r/>
+            <w:r>
+              <w:rPr>
+                <w:b/>
+                <w:sz w:val="17"/>
+              </w:rPr>
+              <w:t>rejected</w:t>
+            </w:r>
+          </w:p>
+        </w:tc>
+      </w:tr>
+      <w:tr>
+        <w:tc>
+          <w:tcPr>
+            <w:tcW w:type="dxa" w:w="1728"/>
+          </w:tcPr>
+          <w:p>
+            <w:r/>
+            <w:r>
+              <w:rPr>
+                <w:sz w:val="17"/>
+              </w:rPr>
+              <w:t>Thessaloniki</w:t>
+            </w:r>
+          </w:p>
+        </w:tc>
+        <w:tc>
+          <w:tcPr>
+            <w:tcW w:type="dxa" w:w="1728"/>
+          </w:tcPr>
+          <w:p>
+            <w:r/>
+            <w:r>
+              <w:rPr>
+                <w:sz w:val="17"/>
+              </w:rPr>
+              <w:t>alzheimers</w:t>
+            </w:r>
+          </w:p>
+        </w:tc>
+        <w:tc>
+          <w:tcPr>
+            <w:tcW w:type="dxa" w:w="1728"/>
+          </w:tcPr>
+          <w:p>
+            <w:r/>
+            <w:r>
+              <w:rPr>
+                <w:sz w:val="17"/>
+              </w:rPr>
+              <w:t>36</w:t>
+            </w:r>
+          </w:p>
+        </w:tc>
+        <w:tc>
+          <w:tcPr>
+            <w:tcW w:type="dxa" w:w="1728"/>
+          </w:tcPr>
+          <w:p>
+            <w:r/>
+            <w:r>
+              <w:rPr>
+                <w:sz w:val="17"/>
+              </w:rPr>
+              <w:t>1080</w:t>
+            </w:r>
+          </w:p>
+        </w:tc>
+        <w:tc>
+          <w:tcPr>
+            <w:tcW w:type="dxa" w:w="1728"/>
+          </w:tcPr>
+          <w:p>
+            <w:r/>
+            <w:r>
+              <w:rPr>
+                <w:sz w:val="17"/>
+              </w:rPr>
+              <w:t>8.8%</w:t>
+            </w:r>
+          </w:p>
+        </w:tc>
+      </w:tr>
+      <w:tr>
+        <w:tc>
+          <w:tcPr>
+            <w:tcW w:type="dxa" w:w="1728"/>
+          </w:tcPr>
+          <w:p>
+            <w:r/>
+            <w:r>
+              <w:rPr>
+                <w:sz w:val="17"/>
+              </w:rPr>
+              <w:t>Thessaloniki</w:t>
+            </w:r>
+          </w:p>
+        </w:tc>
+        <w:tc>
+          <w:tcPr>
+            <w:tcW w:type="dxa" w:w="1728"/>
+          </w:tcPr>
+          <w:p>
+            <w:r/>
+            <w:r>
+              <w:rPr>
+                <w:sz w:val="17"/>
+              </w:rPr>
+              <w:t>control</w:t>
+            </w:r>
+          </w:p>
+        </w:tc>
+        <w:tc>
+          <w:tcPr>
+            <w:tcW w:type="dxa" w:w="1728"/>
+          </w:tcPr>
+          <w:p>
+            <w:r/>
+            <w:r>
+              <w:rPr>
+                <w:sz w:val="17"/>
+              </w:rPr>
+              <w:t>29</w:t>
+            </w:r>
+          </w:p>
+        </w:tc>
+        <w:tc>
+          <w:tcPr>
+            <w:tcW w:type="dxa" w:w="1728"/>
+          </w:tcPr>
+          <w:p>
+            <w:r/>
+            <w:r>
+              <w:rPr>
+                <w:sz w:val="17"/>
+              </w:rPr>
+              <w:t>870</w:t>
+            </w:r>
+          </w:p>
+        </w:tc>
+        <w:tc>
+          <w:tcPr>
+            <w:tcW w:type="dxa" w:w="1728"/>
+          </w:tcPr>
+          <w:p>
+            <w:r/>
+            <w:r>
+              <w:rPr>
+                <w:sz w:val="17"/>
+              </w:rPr>
+              <w:t>5.6%</w:t>
+            </w:r>
+          </w:p>
+        </w:tc>
+      </w:tr>
+      <w:tr>
+        <w:tc>
+          <w:tcPr>
+            <w:tcW w:type="dxa" w:w="1728"/>
+          </w:tcPr>
+          <w:p>
+            <w:r/>
+            <w:r>
+              <w:rPr>
+                <w:sz w:val="17"/>
+              </w:rPr>
+              <w:t>Thessaloniki</w:t>
+            </w:r>
+          </w:p>
+        </w:tc>
+        <w:tc>
+          <w:tcPr>
+            <w:tcW w:type="dxa" w:w="1728"/>
+          </w:tcPr>
+          <w:p>
+            <w:r/>
+            <w:r>
+              <w:rPr>
+                <w:sz w:val="17"/>
+              </w:rPr>
+              <w:t>ftd</w:t>
+            </w:r>
+          </w:p>
+        </w:tc>
+        <w:tc>
+          <w:tcPr>
+            <w:tcW w:type="dxa" w:w="1728"/>
+          </w:tcPr>
+          <w:p>
+            <w:r/>
+            <w:r>
+              <w:rPr>
+                <w:sz w:val="17"/>
+              </w:rPr>
+              <w:t>23</w:t>
+            </w:r>
+          </w:p>
+        </w:tc>
+        <w:tc>
+          <w:tcPr>
+            <w:tcW w:type="dxa" w:w="1728"/>
+          </w:tcPr>
+          <w:p>
+            <w:r/>
+            <w:r>
+              <w:rPr>
+                <w:sz w:val="17"/>
+              </w:rPr>
+              <w:t>673</w:t>
+            </w:r>
+          </w:p>
+        </w:tc>
+        <w:tc>
+          <w:tcPr>
+            <w:tcW w:type="dxa" w:w="1728"/>
+          </w:tcPr>
+          <w:p>
+            <w:r/>
+            <w:r>
+              <w:rPr>
+                <w:sz w:val="17"/>
+              </w:rPr>
+              <w:t>11.4%</w:t>
+            </w:r>
+          </w:p>
+        </w:tc>
+      </w:tr>
+      <w:tr>
+        <w:tc>
+          <w:tcPr>
+            <w:tcW w:type="dxa" w:w="1728"/>
+          </w:tcPr>
+          <w:p>
+            <w:r/>
+            <w:r>
+              <w:rPr>
+                <w:sz w:val="17"/>
+              </w:rPr>
+              <w:t>Iowa</w:t>
+            </w:r>
+          </w:p>
+        </w:tc>
+        <w:tc>
+          <w:tcPr>
+            <w:tcW w:type="dxa" w:w="1728"/>
+          </w:tcPr>
+          <w:p>
+            <w:r/>
+            <w:r>
+              <w:rPr>
+                <w:sz w:val="17"/>
+              </w:rPr>
+              <w:t>control</w:t>
+            </w:r>
+          </w:p>
+        </w:tc>
+        <w:tc>
+          <w:tcPr>
+            <w:tcW w:type="dxa" w:w="1728"/>
+          </w:tcPr>
+          <w:p>
+            <w:r/>
+            <w:r>
+              <w:rPr>
+                <w:sz w:val="17"/>
+              </w:rPr>
+              <w:t>49</w:t>
+            </w:r>
+          </w:p>
+        </w:tc>
+        <w:tc>
+          <w:tcPr>
+            <w:tcW w:type="dxa" w:w="1728"/>
+          </w:tcPr>
+          <w:p>
+            <w:r/>
+            <w:r>
+              <w:rPr>
+                <w:sz w:val="17"/>
+              </w:rPr>
+              <w:t>608</w:t>
+            </w:r>
+          </w:p>
+        </w:tc>
+        <w:tc>
+          <w:tcPr>
+            <w:tcW w:type="dxa" w:w="1728"/>
+          </w:tcPr>
+          <w:p>
+            <w:r/>
+            <w:r>
+              <w:rPr>
+                <w:sz w:val="17"/>
+              </w:rPr>
+              <w:t>25.1%</w:t>
+            </w:r>
+          </w:p>
+        </w:tc>
+      </w:tr>
+      <w:tr>
+        <w:tc>
+          <w:tcPr>
+            <w:tcW w:type="dxa" w:w="1728"/>
+          </w:tcPr>
+          <w:p>
+            <w:r/>
+            <w:r>
+              <w:rPr>
+                <w:sz w:val="17"/>
+              </w:rPr>
+              <w:t>Iowa</w:t>
+            </w:r>
+          </w:p>
+        </w:tc>
+        <w:tc>
+          <w:tcPr>
+            <w:tcW w:type="dxa" w:w="1728"/>
+          </w:tcPr>
+          <w:p>
+            <w:r/>
+            <w:r>
+              <w:rPr>
+                <w:sz w:val="17"/>
+              </w:rPr>
+              <w:t>parkinsons</w:t>
+            </w:r>
+          </w:p>
+        </w:tc>
+        <w:tc>
+          <w:tcPr>
+            <w:tcW w:type="dxa" w:w="1728"/>
+          </w:tcPr>
+          <w:p>
+            <w:r/>
+            <w:r>
+              <w:rPr>
+                <w:sz w:val="17"/>
+              </w:rPr>
+              <w:t>100</w:t>
+            </w:r>
+          </w:p>
+        </w:tc>
+        <w:tc>
+          <w:tcPr>
+            <w:tcW w:type="dxa" w:w="1728"/>
+          </w:tcPr>
+          <w:p>
+            <w:r/>
+            <w:r>
+              <w:rPr>
+                <w:sz w:val="17"/>
+              </w:rPr>
+              <w:t>1260</w:t>
+            </w:r>
+          </w:p>
+        </w:tc>
+        <w:tc>
+          <w:tcPr>
+            <w:tcW w:type="dxa" w:w="1728"/>
+          </w:tcPr>
+          <w:p>
+            <w:r/>
+            <w:r>
+              <w:rPr>
+                <w:sz w:val="17"/>
+              </w:rPr>
+              <w:t>16.4%</w:t>
+            </w:r>
+          </w:p>
+        </w:tc>
+      </w:tr>
+      <w:tr>
+        <w:tc>
+          <w:tcPr>
+            <w:tcW w:type="dxa" w:w="1728"/>
+          </w:tcPr>
+          <w:p>
+            <w:r/>
+            <w:r>
+              <w:rPr>
+                <w:sz w:val="17"/>
+              </w:rPr>
+              <w:t>New Mexico</w:t>
+            </w:r>
+          </w:p>
+        </w:tc>
+        <w:tc>
+          <w:tcPr>
+            <w:tcW w:type="dxa" w:w="1728"/>
+          </w:tcPr>
+          <w:p>
+            <w:r/>
+            <w:r>
+              <w:rPr>
+                <w:sz w:val="17"/>
+              </w:rPr>
+              <w:t>control</w:t>
+            </w:r>
+          </w:p>
+        </w:tc>
+        <w:tc>
+          <w:tcPr>
+            <w:tcW w:type="dxa" w:w="1728"/>
+          </w:tcPr>
+          <w:p>
+            <w:r/>
+            <w:r>
+              <w:rPr>
+                <w:sz w:val="17"/>
+              </w:rPr>
+              <w:t>25</w:t>
+            </w:r>
+          </w:p>
+        </w:tc>
+        <w:tc>
+          <w:tcPr>
+            <w:tcW w:type="dxa" w:w="1728"/>
+          </w:tcPr>
+          <w:p>
+            <w:r/>
+            <w:r>
+              <w:rPr>
+                <w:sz w:val="17"/>
+              </w:rPr>
+              <w:t>106</w:t>
+            </w:r>
+          </w:p>
+        </w:tc>
+        <w:tc>
+          <w:tcPr>
+            <w:tcW w:type="dxa" w:w="1728"/>
+          </w:tcPr>
+          <w:p>
+            <w:r/>
+            <w:r>
+              <w:rPr>
+                <w:sz w:val="17"/>
+              </w:rPr>
+              <w:t>29.3%</w:t>
+            </w:r>
+          </w:p>
+        </w:tc>
+      </w:tr>
+      <w:tr>
+        <w:tc>
+          <w:tcPr>
+            <w:tcW w:type="dxa" w:w="1728"/>
+          </w:tcPr>
+          <w:p>
+            <w:r/>
+            <w:r>
+              <w:rPr>
+                <w:sz w:val="17"/>
+              </w:rPr>
+              <w:t>New Mexico</w:t>
+            </w:r>
+          </w:p>
+        </w:tc>
+        <w:tc>
+          <w:tcPr>
+            <w:tcW w:type="dxa" w:w="1728"/>
+          </w:tcPr>
+          <w:p>
+            <w:r/>
+            <w:r>
+              <w:rPr>
+                <w:sz w:val="17"/>
+              </w:rPr>
+              <w:t>parkinsons</w:t>
+            </w:r>
+          </w:p>
+        </w:tc>
+        <w:tc>
+          <w:tcPr>
+            <w:tcW w:type="dxa" w:w="1728"/>
+          </w:tcPr>
+          <w:p>
+            <w:r/>
+            <w:r>
+              <w:rPr>
+                <w:sz w:val="17"/>
+              </w:rPr>
+              <w:t>25</w:t>
+            </w:r>
+          </w:p>
+        </w:tc>
+        <w:tc>
+          <w:tcPr>
+            <w:tcW w:type="dxa" w:w="1728"/>
+          </w:tcPr>
+          <w:p>
+            <w:r/>
+            <w:r>
+              <w:rPr>
+                <w:sz w:val="17"/>
+              </w:rPr>
+              <w:t>122</w:t>
+            </w:r>
+          </w:p>
+        </w:tc>
+        <w:tc>
+          <w:tcPr>
+            <w:tcW w:type="dxa" w:w="1728"/>
+          </w:tcPr>
+          <w:p>
+            <w:r/>
+            <w:r>
+              <w:rPr>
+                <w:sz w:val="17"/>
+              </w:rPr>
+              <w:t>18.7%</w:t>
+            </w:r>
+          </w:p>
+        </w:tc>
+      </w:tr>
+      <w:tr>
+        <w:tc>
+          <w:tcPr>
+            <w:tcW w:type="dxa" w:w="1728"/>
+          </w:tcPr>
+          <w:p>
+            <w:r/>
+            <w:r>
+              <w:rPr>
+                <w:sz w:val="17"/>
+              </w:rPr>
+              <w:t>San Diego</w:t>
+            </w:r>
+          </w:p>
+        </w:tc>
+        <w:tc>
+          <w:tcPr>
+            <w:tcW w:type="dxa" w:w="1728"/>
+          </w:tcPr>
+          <w:p>
+            <w:r/>
+            <w:r>
+              <w:rPr>
+                <w:sz w:val="17"/>
+              </w:rPr>
+              <w:t>control</w:t>
+            </w:r>
+          </w:p>
+        </w:tc>
+        <w:tc>
+          <w:tcPr>
+            <w:tcW w:type="dxa" w:w="1728"/>
+          </w:tcPr>
+          <w:p>
+            <w:r/>
+            <w:r>
+              <w:rPr>
+                <w:sz w:val="17"/>
+              </w:rPr>
+              <w:t>16</w:t>
+            </w:r>
+          </w:p>
+        </w:tc>
+        <w:tc>
+          <w:tcPr>
+            <w:tcW w:type="dxa" w:w="1728"/>
+          </w:tcPr>
+          <w:p>
+            <w:r/>
+            <w:r>
+              <w:rPr>
+                <w:sz w:val="17"/>
+              </w:rPr>
+              <w:t>261</w:t>
+            </w:r>
+          </w:p>
+        </w:tc>
+        <w:tc>
+          <w:tcPr>
+            <w:tcW w:type="dxa" w:w="1728"/>
+          </w:tcPr>
+          <w:p>
+            <w:r/>
+            <w:r>
+              <w:rPr>
+                <w:sz w:val="17"/>
+              </w:rPr>
+              <w:t>13.0%</w:t>
+            </w:r>
+          </w:p>
+        </w:tc>
+      </w:tr>
+      <w:tr>
+        <w:tc>
+          <w:tcPr>
+            <w:tcW w:type="dxa" w:w="1728"/>
+          </w:tcPr>
+          <w:p>
+            <w:r/>
+            <w:r>
+              <w:rPr>
+                <w:sz w:val="17"/>
+              </w:rPr>
+              <w:t>San Diego</w:t>
+            </w:r>
+          </w:p>
+        </w:tc>
+        <w:tc>
+          <w:tcPr>
+            <w:tcW w:type="dxa" w:w="1728"/>
+          </w:tcPr>
+          <w:p>
+            <w:r/>
+            <w:r>
+              <w:rPr>
+                <w:sz w:val="17"/>
+              </w:rPr>
+              <w:t>parkinsons</w:t>
+            </w:r>
+          </w:p>
+        </w:tc>
+        <w:tc>
+          <w:tcPr>
+            <w:tcW w:type="dxa" w:w="1728"/>
+          </w:tcPr>
+          <w:p>
+            <w:r/>
+            <w:r>
+              <w:rPr>
+                <w:sz w:val="17"/>
+              </w:rPr>
+              <w:t>15</w:t>
+            </w:r>
+          </w:p>
+        </w:tc>
+        <w:tc>
+          <w:tcPr>
+            <w:tcW w:type="dxa" w:w="1728"/>
+          </w:tcPr>
+          <w:p>
+            <w:r/>
+            <w:r>
+              <w:rPr>
+                <w:sz w:val="17"/>
+              </w:rPr>
+              <w:t>261</w:t>
+            </w:r>
+          </w:p>
+        </w:tc>
+        <w:tc>
+          <w:tcPr>
+            <w:tcW w:type="dxa" w:w="1728"/>
+          </w:tcPr>
+          <w:p>
+            <w:r/>
+            <w:r>
+              <w:rPr>
+                <w:sz w:val="17"/>
+              </w:rPr>
+              <w:t>10.9%</w:t>
+            </w:r>
+          </w:p>
+        </w:tc>
+      </w:tr>
+    </w:tbl>
+    <w:p>
+      <w:r>
+        <w:rPr>
+          <w:i/>
+          <w:color w:val="52514E"/>
+          <w:sz w:val="16"/>
+        </w:rPr>
+        <w:t>Same rejection rule and 30-window cap as section 5.4.</w:t>
+      </w:r>
+    </w:p>
+    <w:p/>
+    <w:p>
+      <w:r>
+        <w:t>Blink check. In eyes-open recordings, large-amplitude rejections are typically blinks and eye movements (not verified channel by channel here), and a reduced spontaneous blink rate is a clinical sign of Parkinson's. Controls lost more windows than patients at 3 of 3 Parkinson's hospitals (Iowa controls 25% vs patients 16%; New Mexico controls 29% vs patients 19%; San Diego controls 13% vs patients 11%). Where that gap exists, blinking differs between the groups, and the blinks that survive rejection reach the model through frontal slow-wave power and coherence. The cross-hospital transfer may therefore partly reflect blink rate rather than cortical rhythms. The direct test is to rerun without the frontal-pole electrodes (Fp1, Fp2) and see whether transfer survives; it has not been run yet.</w:t>
+      </w:r>
+    </w:p>
+    <w:p>
+      <w:pPr>
+        <w:jc w:val="center"/>
+      </w:pPr>
+      <w:r>
+        <w:drawing>
+          <wp:inline xmlns:a="http://schemas.openxmlformats.org/drawingml/2006/main" xmlns:pic="http://schemas.openxmlformats.org/drawingml/2006/picture">
+            <wp:extent cx="5760720" cy="3729106"/>
+            <wp:docPr id="9" name="Picture 9"/>
+            <wp:cNvGraphicFramePr>
+              <a:graphicFrameLocks noChangeAspect="1"/>
+            </wp:cNvGraphicFramePr>
+            <a:graphic>
+              <a:graphicData uri="http://schemas.openxmlformats.org/drawingml/2006/picture">
+                <pic:pic>
+                  <pic:nvPicPr>
+                    <pic:cNvPr id="0" name="neuro_auc.png"/>
+                    <pic:cNvPicPr/>
+                  </pic:nvPicPr>
+                  <pic:blipFill>
+                    <a:blip r:embed="rId17"/>
+                    <a:stretch>
+                      <a:fillRect/>
+                    </a:stretch>
+                  </pic:blipFill>
+                  <pic:spPr>
+                    <a:xfrm>
+                      <a:off x="0" y="0"/>
+                      <a:ext cx="5760720" cy="3729106"/>
+                    </a:xfrm>
+                    <a:prstGeom prst="rect"/>
+                  </pic:spPr>
+                </pic:pic>
+              </a:graphicData>
+            </a:graphic>
+          </wp:inline>
+        </w:drawing>
+      </w:r>
+    </w:p>
+    <w:p>
+      <w:pPr>
+        <w:jc w:val="center"/>
+      </w:pPr>
+      <w:r>
+        <w:rPr>
+          <w:i/>
+          <w:sz w:val="17"/>
+        </w:rPr>
+        <w:t>Figure 9. Neurological results. For Parkinson's the figure shows leave-one-hospital-out (trained on the other two hospitals); the table below also lists every pairwise transfer.</w:t>
+      </w:r>
+    </w:p>
+    <w:tbl>
+      <w:tblPr>
+        <w:tblStyle w:val="TableGrid"/>
+        <w:tblW w:type="auto" w:w="0"/>
+        <w:jc w:val="center"/>
+        <w:tblLook w:firstColumn="1" w:firstRow="1" w:lastColumn="0" w:lastRow="0" w:noHBand="0" w:noVBand="1" w:val="04A0"/>
+      </w:tblPr>
+      <w:tblGrid>
+        <w:gridCol w:w="2160"/>
+        <w:gridCol w:w="2160"/>
+        <w:gridCol w:w="2160"/>
+        <w:gridCol w:w="2160"/>
+      </w:tblGrid>
+      <w:tr>
+        <w:tc>
+          <w:tcPr>
+            <w:tcW w:type="dxa" w:w="2160"/>
+            <w:shd w:val="clear" w:color="auto" w:fill="eef3fb"/>
+          </w:tcPr>
+          <w:p>
+            <w:r/>
+            <w:r>
+              <w:rPr>
+                <w:b/>
+                <w:sz w:val="17"/>
+              </w:rPr>
+              <w:t>evaluation</w:t>
+            </w:r>
+          </w:p>
+        </w:tc>
+        <w:tc>
+          <w:tcPr>
+            <w:tcW w:type="dxa" w:w="2160"/>
+            <w:shd w:val="clear" w:color="auto" w:fill="eef3fb"/>
+          </w:tcPr>
+          <w:p>
+            <w:r/>
+            <w:r>
+              <w:rPr>
+                <w:b/>
+                <w:sz w:val="17"/>
+              </w:rPr>
+              <w:t>AUC [95% CI]</w:t>
+            </w:r>
+          </w:p>
+        </w:tc>
+        <w:tc>
+          <w:tcPr>
+            <w:tcW w:type="dxa" w:w="2160"/>
+            <w:shd w:val="clear" w:color="auto" w:fill="eef3fb"/>
+          </w:tcPr>
+          <w:p>
+            <w:r/>
+            <w:r>
+              <w:rPr>
+                <w:b/>
+                <w:sz w:val="17"/>
+              </w:rPr>
+              <w:t>positive</w:t>
+            </w:r>
+          </w:p>
+        </w:tc>
+        <w:tc>
+          <w:tcPr>
+            <w:tcW w:type="dxa" w:w="2160"/>
+            <w:shd w:val="clear" w:color="auto" w:fill="eef3fb"/>
+          </w:tcPr>
+          <w:p>
+            <w:r/>
+            <w:r>
+              <w:rPr>
+                <w:b/>
+                <w:sz w:val="17"/>
+              </w:rPr>
+              <w:t>negative</w:t>
+            </w:r>
+          </w:p>
+        </w:tc>
+      </w:tr>
+      <w:tr>
+        <w:tc>
+          <w:tcPr>
+            <w:tcW w:type="dxa" w:w="2160"/>
+          </w:tcPr>
+          <w:p>
+            <w:r/>
+            <w:r>
+              <w:rPr>
+                <w:sz w:val="17"/>
+              </w:rPr>
+              <w:t>AD: within Thessaloniki</w:t>
+            </w:r>
+          </w:p>
+        </w:tc>
+        <w:tc>
+          <w:tcPr>
+            <w:tcW w:type="dxa" w:w="2160"/>
+          </w:tcPr>
+          <w:p>
+            <w:r/>
+            <w:r>
+              <w:rPr>
+                <w:sz w:val="17"/>
+              </w:rPr>
+              <w:t>0.885 [0.80, 0.97]</w:t>
+            </w:r>
+          </w:p>
+        </w:tc>
+        <w:tc>
+          <w:tcPr>
+            <w:tcW w:type="dxa" w:w="2160"/>
+          </w:tcPr>
+          <w:p>
+            <w:r/>
+            <w:r>
+              <w:rPr>
+                <w:sz w:val="17"/>
+              </w:rPr>
+              <w:t>36</w:t>
+            </w:r>
+          </w:p>
+        </w:tc>
+        <w:tc>
+          <w:tcPr>
+            <w:tcW w:type="dxa" w:w="2160"/>
+          </w:tcPr>
+          <w:p>
+            <w:r/>
+            <w:r>
+              <w:rPr>
+                <w:sz w:val="17"/>
+              </w:rPr>
+              <w:t>29</w:t>
+            </w:r>
+          </w:p>
+        </w:tc>
+      </w:tr>
+      <w:tr>
+        <w:tc>
+          <w:tcPr>
+            <w:tcW w:type="dxa" w:w="2160"/>
+          </w:tcPr>
+          <w:p>
+            <w:r/>
+            <w:r>
+              <w:rPr>
+                <w:sz w:val="17"/>
+              </w:rPr>
+              <w:t>FTD: within Thessaloniki</w:t>
+            </w:r>
+          </w:p>
+        </w:tc>
+        <w:tc>
+          <w:tcPr>
+            <w:tcW w:type="dxa" w:w="2160"/>
+          </w:tcPr>
+          <w:p>
+            <w:r/>
+            <w:r>
+              <w:rPr>
+                <w:sz w:val="17"/>
+              </w:rPr>
+              <w:t>0.787 [0.64, 0.92]</w:t>
+            </w:r>
+          </w:p>
+        </w:tc>
+        <w:tc>
+          <w:tcPr>
+            <w:tcW w:type="dxa" w:w="2160"/>
+          </w:tcPr>
+          <w:p>
+            <w:r/>
+            <w:r>
+              <w:rPr>
+                <w:sz w:val="17"/>
+              </w:rPr>
+              <w:t>23</w:t>
+            </w:r>
+          </w:p>
+        </w:tc>
+        <w:tc>
+          <w:tcPr>
+            <w:tcW w:type="dxa" w:w="2160"/>
+          </w:tcPr>
+          <w:p>
+            <w:r/>
+            <w:r>
+              <w:rPr>
+                <w:sz w:val="17"/>
+              </w:rPr>
+              <w:t>29</w:t>
+            </w:r>
+          </w:p>
+        </w:tc>
+      </w:tr>
+      <w:tr>
+        <w:tc>
+          <w:tcPr>
+            <w:tcW w:type="dxa" w:w="2160"/>
+          </w:tcPr>
+          <w:p>
+            <w:r/>
+            <w:r>
+              <w:rPr>
+                <w:sz w:val="17"/>
+              </w:rPr>
+              <w:t>AD vs FTD: within Thessaloniki</w:t>
+            </w:r>
+          </w:p>
+        </w:tc>
+        <w:tc>
+          <w:tcPr>
+            <w:tcW w:type="dxa" w:w="2160"/>
+          </w:tcPr>
+          <w:p>
+            <w:r/>
+            <w:r>
+              <w:rPr>
+                <w:sz w:val="17"/>
+              </w:rPr>
+              <w:t>0.634 [0.49, 0.77]</w:t>
+            </w:r>
+          </w:p>
+        </w:tc>
+        <w:tc>
+          <w:tcPr>
+            <w:tcW w:type="dxa" w:w="2160"/>
+          </w:tcPr>
+          <w:p>
+            <w:r/>
+            <w:r>
+              <w:rPr>
+                <w:sz w:val="17"/>
+              </w:rPr>
+              <w:t>36</w:t>
+            </w:r>
+          </w:p>
+        </w:tc>
+        <w:tc>
+          <w:tcPr>
+            <w:tcW w:type="dxa" w:w="2160"/>
+          </w:tcPr>
+          <w:p>
+            <w:r/>
+            <w:r>
+              <w:rPr>
+                <w:sz w:val="17"/>
+              </w:rPr>
+              <w:t>23</w:t>
+            </w:r>
+          </w:p>
+        </w:tc>
+      </w:tr>
+      <w:tr>
+        <w:tc>
+          <w:tcPr>
+            <w:tcW w:type="dxa" w:w="2160"/>
+          </w:tcPr>
+          <w:p>
+            <w:r/>
+            <w:r>
+              <w:rPr>
+                <w:sz w:val="17"/>
+              </w:rPr>
+              <w:t>PD: within Iowa</w:t>
+            </w:r>
+          </w:p>
+        </w:tc>
+        <w:tc>
+          <w:tcPr>
+            <w:tcW w:type="dxa" w:w="2160"/>
+          </w:tcPr>
+          <w:p>
+            <w:r/>
+            <w:r>
+              <w:rPr>
+                <w:sz w:val="17"/>
+              </w:rPr>
+              <w:t>0.575 [0.48, 0.68]</w:t>
+            </w:r>
+          </w:p>
+        </w:tc>
+        <w:tc>
+          <w:tcPr>
+            <w:tcW w:type="dxa" w:w="2160"/>
+          </w:tcPr>
+          <w:p>
+            <w:r/>
+            <w:r>
+              <w:rPr>
+                <w:sz w:val="17"/>
+              </w:rPr>
+              <w:t>97</w:t>
+            </w:r>
+          </w:p>
+        </w:tc>
+        <w:tc>
+          <w:tcPr>
+            <w:tcW w:type="dxa" w:w="2160"/>
+          </w:tcPr>
+          <w:p>
+            <w:r/>
+            <w:r>
+              <w:rPr>
+                <w:sz w:val="17"/>
+              </w:rPr>
+              <w:t>48</w:t>
+            </w:r>
+          </w:p>
+        </w:tc>
+      </w:tr>
+      <w:tr>
+        <w:tc>
+          <w:tcPr>
+            <w:tcW w:type="dxa" w:w="2160"/>
+          </w:tcPr>
+          <w:p>
+            <w:r/>
+            <w:r>
+              <w:rPr>
+                <w:sz w:val="17"/>
+              </w:rPr>
+              <w:t>PD: within New Mexico</w:t>
+            </w:r>
+          </w:p>
+        </w:tc>
+        <w:tc>
+          <w:tcPr>
+            <w:tcW w:type="dxa" w:w="2160"/>
+          </w:tcPr>
+          <w:p>
+            <w:r/>
+            <w:r>
+              <w:rPr>
+                <w:sz w:val="17"/>
+              </w:rPr>
+              <w:t>0.702 [0.53, 0.85]</w:t>
+            </w:r>
+          </w:p>
+        </w:tc>
+        <w:tc>
+          <w:tcPr>
+            <w:tcW w:type="dxa" w:w="2160"/>
+          </w:tcPr>
+          <w:p>
+            <w:r/>
+            <w:r>
+              <w:rPr>
+                <w:sz w:val="17"/>
+              </w:rPr>
+              <w:t>23</w:t>
+            </w:r>
+          </w:p>
+        </w:tc>
+        <w:tc>
+          <w:tcPr>
+            <w:tcW w:type="dxa" w:w="2160"/>
+          </w:tcPr>
+          <w:p>
+            <w:r/>
+            <w:r>
+              <w:rPr>
+                <w:sz w:val="17"/>
+              </w:rPr>
+              <w:t>21</w:t>
+            </w:r>
+          </w:p>
+        </w:tc>
+      </w:tr>
+      <w:tr>
+        <w:tc>
+          <w:tcPr>
+            <w:tcW w:type="dxa" w:w="2160"/>
+          </w:tcPr>
+          <w:p>
+            <w:r/>
+            <w:r>
+              <w:rPr>
+                <w:sz w:val="17"/>
+              </w:rPr>
+              <w:t>PD: within San Diego</w:t>
+            </w:r>
+          </w:p>
+        </w:tc>
+        <w:tc>
+          <w:tcPr>
+            <w:tcW w:type="dxa" w:w="2160"/>
+          </w:tcPr>
+          <w:p>
+            <w:r/>
+            <w:r>
+              <w:rPr>
+                <w:sz w:val="17"/>
+              </w:rPr>
+              <w:t>0.667 [0.46, 0.85]</w:t>
+            </w:r>
+          </w:p>
+        </w:tc>
+        <w:tc>
+          <w:tcPr>
+            <w:tcW w:type="dxa" w:w="2160"/>
+          </w:tcPr>
+          <w:p>
+            <w:r/>
+            <w:r>
+              <w:rPr>
+                <w:sz w:val="17"/>
+              </w:rPr>
+              <w:t>15</w:t>
+            </w:r>
+          </w:p>
+        </w:tc>
+        <w:tc>
+          <w:tcPr>
+            <w:tcW w:type="dxa" w:w="2160"/>
+          </w:tcPr>
+          <w:p>
+            <w:r/>
+            <w:r>
+              <w:rPr>
+                <w:sz w:val="17"/>
+              </w:rPr>
+              <w:t>16</w:t>
+            </w:r>
+          </w:p>
+        </w:tc>
+      </w:tr>
+      <w:tr>
+        <w:tc>
+          <w:tcPr>
+            <w:tcW w:type="dxa" w:w="2160"/>
+          </w:tcPr>
+          <w:p>
+            <w:r/>
+            <w:r>
+              <w:rPr>
+                <w:sz w:val="17"/>
+              </w:rPr>
+              <w:t>PD: pooled (3 hospitals)</w:t>
+            </w:r>
+          </w:p>
+        </w:tc>
+        <w:tc>
+          <w:tcPr>
+            <w:tcW w:type="dxa" w:w="2160"/>
+          </w:tcPr>
+          <w:p>
+            <w:r/>
+            <w:r>
+              <w:rPr>
+                <w:sz w:val="17"/>
+              </w:rPr>
+              <w:t>0.685 [0.61, 0.76]</w:t>
+            </w:r>
+          </w:p>
+        </w:tc>
+        <w:tc>
+          <w:tcPr>
+            <w:tcW w:type="dxa" w:w="2160"/>
+          </w:tcPr>
+          <w:p>
+            <w:r/>
+            <w:r>
+              <w:rPr>
+                <w:sz w:val="17"/>
+              </w:rPr>
+              <w:t>135</w:t>
+            </w:r>
+          </w:p>
+        </w:tc>
+        <w:tc>
+          <w:tcPr>
+            <w:tcW w:type="dxa" w:w="2160"/>
+          </w:tcPr>
+          <w:p>
+            <w:r/>
+            <w:r>
+              <w:rPr>
+                <w:sz w:val="17"/>
+              </w:rPr>
+              <w:t>85</w:t>
+            </w:r>
+          </w:p>
+        </w:tc>
+      </w:tr>
+      <w:tr>
+        <w:tc>
+          <w:tcPr>
+            <w:tcW w:type="dxa" w:w="2160"/>
+          </w:tcPr>
+          <w:p>
+            <w:r/>
+            <w:r>
+              <w:rPr>
+                <w:sz w:val="17"/>
+              </w:rPr>
+              <w:t>PD: pooled, scored on Iowa</w:t>
+            </w:r>
+          </w:p>
+        </w:tc>
+        <w:tc>
+          <w:tcPr>
+            <w:tcW w:type="dxa" w:w="2160"/>
+          </w:tcPr>
+          <w:p>
+            <w:r/>
+            <w:r>
+              <w:rPr>
+                <w:sz w:val="17"/>
+              </w:rPr>
+              <w:t>0.630 [0.53, 0.73]</w:t>
+            </w:r>
+          </w:p>
+        </w:tc>
+        <w:tc>
+          <w:tcPr>
+            <w:tcW w:type="dxa" w:w="2160"/>
+          </w:tcPr>
+          <w:p>
+            <w:r/>
+            <w:r>
+              <w:rPr>
+                <w:sz w:val="17"/>
+              </w:rPr>
+              <w:t>97</w:t>
+            </w:r>
+          </w:p>
+        </w:tc>
+        <w:tc>
+          <w:tcPr>
+            <w:tcW w:type="dxa" w:w="2160"/>
+          </w:tcPr>
+          <w:p>
+            <w:r/>
+            <w:r>
+              <w:rPr>
+                <w:sz w:val="17"/>
+              </w:rPr>
+              <w:t>48</w:t>
+            </w:r>
+          </w:p>
+        </w:tc>
+      </w:tr>
+      <w:tr>
+        <w:tc>
+          <w:tcPr>
+            <w:tcW w:type="dxa" w:w="2160"/>
+          </w:tcPr>
+          <w:p>
+            <w:r/>
+            <w:r>
+              <w:rPr>
+                <w:sz w:val="17"/>
+              </w:rPr>
+              <w:t>PD: pooled, scored on New Mexico</w:t>
+            </w:r>
+          </w:p>
+        </w:tc>
+        <w:tc>
+          <w:tcPr>
+            <w:tcW w:type="dxa" w:w="2160"/>
+          </w:tcPr>
+          <w:p>
+            <w:r/>
+            <w:r>
+              <w:rPr>
+                <w:sz w:val="17"/>
+              </w:rPr>
+              <w:t>0.749 [0.58, 0.89]</w:t>
+            </w:r>
+          </w:p>
+        </w:tc>
+        <w:tc>
+          <w:tcPr>
+            <w:tcW w:type="dxa" w:w="2160"/>
+          </w:tcPr>
+          <w:p>
+            <w:r/>
+            <w:r>
+              <w:rPr>
+                <w:sz w:val="17"/>
+              </w:rPr>
+              <w:t>23</w:t>
+            </w:r>
+          </w:p>
+        </w:tc>
+        <w:tc>
+          <w:tcPr>
+            <w:tcW w:type="dxa" w:w="2160"/>
+          </w:tcPr>
+          <w:p>
+            <w:r/>
+            <w:r>
+              <w:rPr>
+                <w:sz w:val="17"/>
+              </w:rPr>
+              <w:t>21</w:t>
+            </w:r>
+          </w:p>
+        </w:tc>
+      </w:tr>
+      <w:tr>
+        <w:tc>
+          <w:tcPr>
+            <w:tcW w:type="dxa" w:w="2160"/>
+          </w:tcPr>
+          <w:p>
+            <w:r/>
+            <w:r>
+              <w:rPr>
+                <w:sz w:val="17"/>
+              </w:rPr>
+              <w:t>PD: pooled, scored on San Diego</w:t>
+            </w:r>
+          </w:p>
+        </w:tc>
+        <w:tc>
+          <w:tcPr>
+            <w:tcW w:type="dxa" w:w="2160"/>
+          </w:tcPr>
+          <w:p>
+            <w:r/>
+            <w:r>
+              <w:rPr>
+                <w:sz w:val="17"/>
+              </w:rPr>
+              <w:t>0.725 [0.53, 0.89]</w:t>
+            </w:r>
+          </w:p>
+        </w:tc>
+        <w:tc>
+          <w:tcPr>
+            <w:tcW w:type="dxa" w:w="2160"/>
+          </w:tcPr>
+          <w:p>
+            <w:r/>
+            <w:r>
+              <w:rPr>
+                <w:sz w:val="17"/>
+              </w:rPr>
+              <w:t>15</w:t>
+            </w:r>
+          </w:p>
+        </w:tc>
+        <w:tc>
+          <w:tcPr>
+            <w:tcW w:type="dxa" w:w="2160"/>
+          </w:tcPr>
+          <w:p>
+            <w:r/>
+            <w:r>
+              <w:rPr>
+                <w:sz w:val="17"/>
+              </w:rPr>
+              <w:t>16</w:t>
+            </w:r>
+          </w:p>
+        </w:tc>
+      </w:tr>
+      <w:tr>
+        <w:tc>
+          <w:tcPr>
+            <w:tcW w:type="dxa" w:w="2160"/>
+          </w:tcPr>
+          <w:p>
+            <w:r/>
+            <w:r>
+              <w:rPr>
+                <w:sz w:val="17"/>
+              </w:rPr>
+              <w:t>PD: train Iowa, test New Mexico</w:t>
+            </w:r>
+          </w:p>
+        </w:tc>
+        <w:tc>
+          <w:tcPr>
+            <w:tcW w:type="dxa" w:w="2160"/>
+          </w:tcPr>
+          <w:p>
+            <w:r/>
+            <w:r>
+              <w:rPr>
+                <w:sz w:val="17"/>
+              </w:rPr>
+              <w:t>0.741 [0.58, 0.88]</w:t>
+            </w:r>
+          </w:p>
+        </w:tc>
+        <w:tc>
+          <w:tcPr>
+            <w:tcW w:type="dxa" w:w="2160"/>
+          </w:tcPr>
+          <w:p>
+            <w:r/>
+            <w:r>
+              <w:rPr>
+                <w:sz w:val="17"/>
+              </w:rPr>
+              <w:t>23</w:t>
+            </w:r>
+          </w:p>
+        </w:tc>
+        <w:tc>
+          <w:tcPr>
+            <w:tcW w:type="dxa" w:w="2160"/>
+          </w:tcPr>
+          <w:p>
+            <w:r/>
+            <w:r>
+              <w:rPr>
+                <w:sz w:val="17"/>
+              </w:rPr>
+              <w:t>21</w:t>
+            </w:r>
+          </w:p>
+        </w:tc>
+      </w:tr>
+      <w:tr>
+        <w:tc>
+          <w:tcPr>
+            <w:tcW w:type="dxa" w:w="2160"/>
+          </w:tcPr>
+          <w:p>
+            <w:r/>
+            <w:r>
+              <w:rPr>
+                <w:sz w:val="17"/>
+              </w:rPr>
+              <w:t>PD: train Iowa, test San Diego</w:t>
+            </w:r>
+          </w:p>
+        </w:tc>
+        <w:tc>
+          <w:tcPr>
+            <w:tcW w:type="dxa" w:w="2160"/>
+          </w:tcPr>
+          <w:p>
+            <w:r/>
+            <w:r>
+              <w:rPr>
+                <w:sz w:val="17"/>
+              </w:rPr>
+              <w:t>0.758 [0.55, 0.92]</w:t>
+            </w:r>
+          </w:p>
+        </w:tc>
+        <w:tc>
+          <w:tcPr>
+            <w:tcW w:type="dxa" w:w="2160"/>
+          </w:tcPr>
+          <w:p>
+            <w:r/>
+            <w:r>
+              <w:rPr>
+                <w:sz w:val="17"/>
+              </w:rPr>
+              <w:t>15</w:t>
+            </w:r>
+          </w:p>
+        </w:tc>
+        <w:tc>
+          <w:tcPr>
+            <w:tcW w:type="dxa" w:w="2160"/>
+          </w:tcPr>
+          <w:p>
+            <w:r/>
+            <w:r>
+              <w:rPr>
+                <w:sz w:val="17"/>
+              </w:rPr>
+              <w:t>16</w:t>
+            </w:r>
+          </w:p>
+        </w:tc>
+      </w:tr>
+      <w:tr>
+        <w:tc>
+          <w:tcPr>
+            <w:tcW w:type="dxa" w:w="2160"/>
+          </w:tcPr>
+          <w:p>
+            <w:r/>
+            <w:r>
+              <w:rPr>
+                <w:sz w:val="17"/>
+              </w:rPr>
+              <w:t>PD: train New Mexico, test Iowa</w:t>
+            </w:r>
+          </w:p>
+        </w:tc>
+        <w:tc>
+          <w:tcPr>
+            <w:tcW w:type="dxa" w:w="2160"/>
+          </w:tcPr>
+          <w:p>
+            <w:r/>
+            <w:r>
+              <w:rPr>
+                <w:sz w:val="17"/>
+              </w:rPr>
+              <w:t>0.625 [0.51, 0.73]</w:t>
+            </w:r>
+          </w:p>
+        </w:tc>
+        <w:tc>
+          <w:tcPr>
+            <w:tcW w:type="dxa" w:w="2160"/>
+          </w:tcPr>
+          <w:p>
+            <w:r/>
+            <w:r>
+              <w:rPr>
+                <w:sz w:val="17"/>
+              </w:rPr>
+              <w:t>97</w:t>
+            </w:r>
+          </w:p>
+        </w:tc>
+        <w:tc>
+          <w:tcPr>
+            <w:tcW w:type="dxa" w:w="2160"/>
+          </w:tcPr>
+          <w:p>
+            <w:r/>
+            <w:r>
+              <w:rPr>
+                <w:sz w:val="17"/>
+              </w:rPr>
+              <w:t>48</w:t>
+            </w:r>
+          </w:p>
+        </w:tc>
+      </w:tr>
+      <w:tr>
+        <w:tc>
+          <w:tcPr>
+            <w:tcW w:type="dxa" w:w="2160"/>
+          </w:tcPr>
+          <w:p>
+            <w:r/>
+            <w:r>
+              <w:rPr>
+                <w:sz w:val="17"/>
+              </w:rPr>
+              <w:t>PD: train New Mexico, test San Diego</w:t>
+            </w:r>
+          </w:p>
+        </w:tc>
+        <w:tc>
+          <w:tcPr>
+            <w:tcW w:type="dxa" w:w="2160"/>
+          </w:tcPr>
+          <w:p>
+            <w:r/>
+            <w:r>
+              <w:rPr>
+                <w:sz w:val="17"/>
+              </w:rPr>
+              <w:t>0.567 [0.35, 0.76]</w:t>
+            </w:r>
+          </w:p>
+        </w:tc>
+        <w:tc>
+          <w:tcPr>
+            <w:tcW w:type="dxa" w:w="2160"/>
+          </w:tcPr>
+          <w:p>
+            <w:r/>
+            <w:r>
+              <w:rPr>
+                <w:sz w:val="17"/>
+              </w:rPr>
+              <w:t>15</w:t>
+            </w:r>
+          </w:p>
+        </w:tc>
+        <w:tc>
+          <w:tcPr>
+            <w:tcW w:type="dxa" w:w="2160"/>
+          </w:tcPr>
+          <w:p>
+            <w:r/>
+            <w:r>
+              <w:rPr>
+                <w:sz w:val="17"/>
+              </w:rPr>
+              <w:t>16</w:t>
+            </w:r>
+          </w:p>
+        </w:tc>
+      </w:tr>
+      <w:tr>
+        <w:tc>
+          <w:tcPr>
+            <w:tcW w:type="dxa" w:w="2160"/>
+          </w:tcPr>
+          <w:p>
+            <w:r/>
+            <w:r>
+              <w:rPr>
+                <w:sz w:val="17"/>
+              </w:rPr>
+              <w:t>PD: train San Diego, test Iowa</w:t>
+            </w:r>
+          </w:p>
+        </w:tc>
+        <w:tc>
+          <w:tcPr>
+            <w:tcW w:type="dxa" w:w="2160"/>
+          </w:tcPr>
+          <w:p>
+            <w:r/>
+            <w:r>
+              <w:rPr>
+                <w:sz w:val="17"/>
+              </w:rPr>
+              <w:t>0.694 [0.59, 0.79]</w:t>
+            </w:r>
+          </w:p>
+        </w:tc>
+        <w:tc>
+          <w:tcPr>
+            <w:tcW w:type="dxa" w:w="2160"/>
+          </w:tcPr>
+          <w:p>
+            <w:r/>
+            <w:r>
+              <w:rPr>
+                <w:sz w:val="17"/>
+              </w:rPr>
+              <w:t>97</w:t>
+            </w:r>
+          </w:p>
+        </w:tc>
+        <w:tc>
+          <w:tcPr>
+            <w:tcW w:type="dxa" w:w="2160"/>
+          </w:tcPr>
+          <w:p>
+            <w:r/>
+            <w:r>
+              <w:rPr>
+                <w:sz w:val="17"/>
+              </w:rPr>
+              <w:t>48</w:t>
+            </w:r>
+          </w:p>
+        </w:tc>
+      </w:tr>
+      <w:tr>
+        <w:tc>
+          <w:tcPr>
+            <w:tcW w:type="dxa" w:w="2160"/>
+          </w:tcPr>
+          <w:p>
+            <w:r/>
+            <w:r>
+              <w:rPr>
+                <w:sz w:val="17"/>
+              </w:rPr>
+              <w:t>PD: train San Diego, test New Mexico</w:t>
+            </w:r>
+          </w:p>
+        </w:tc>
+        <w:tc>
+          <w:tcPr>
+            <w:tcW w:type="dxa" w:w="2160"/>
+          </w:tcPr>
+          <w:p>
+            <w:r/>
+            <w:r>
+              <w:rPr>
+                <w:sz w:val="17"/>
+              </w:rPr>
+              <w:t>0.735 [0.56, 0.88]</w:t>
+            </w:r>
+          </w:p>
+        </w:tc>
+        <w:tc>
+          <w:tcPr>
+            <w:tcW w:type="dxa" w:w="2160"/>
+          </w:tcPr>
+          <w:p>
+            <w:r/>
+            <w:r>
+              <w:rPr>
+                <w:sz w:val="17"/>
+              </w:rPr>
+              <w:t>23</w:t>
+            </w:r>
+          </w:p>
+        </w:tc>
+        <w:tc>
+          <w:tcPr>
+            <w:tcW w:type="dxa" w:w="2160"/>
+          </w:tcPr>
+          <w:p>
+            <w:r/>
+            <w:r>
+              <w:rPr>
+                <w:sz w:val="17"/>
+              </w:rPr>
+              <w:t>21</w:t>
+            </w:r>
+          </w:p>
+        </w:tc>
+      </w:tr>
+      <w:tr>
+        <w:tc>
+          <w:tcPr>
+            <w:tcW w:type="dxa" w:w="2160"/>
+          </w:tcPr>
+          <w:p>
+            <w:r/>
+            <w:r>
+              <w:rPr>
+                <w:sz w:val="17"/>
+              </w:rPr>
+              <w:t>PD: trained elsewhere, test Iowa</w:t>
+            </w:r>
+          </w:p>
+        </w:tc>
+        <w:tc>
+          <w:tcPr>
+            <w:tcW w:type="dxa" w:w="2160"/>
+          </w:tcPr>
+          <w:p>
+            <w:r/>
+            <w:r>
+              <w:rPr>
+                <w:sz w:val="17"/>
+              </w:rPr>
+              <w:t>0.680 [0.58, 0.78]</w:t>
+            </w:r>
+          </w:p>
+        </w:tc>
+        <w:tc>
+          <w:tcPr>
+            <w:tcW w:type="dxa" w:w="2160"/>
+          </w:tcPr>
+          <w:p>
+            <w:r/>
+            <w:r>
+              <w:rPr>
+                <w:sz w:val="17"/>
+              </w:rPr>
+              <w:t>97</w:t>
+            </w:r>
+          </w:p>
+        </w:tc>
+        <w:tc>
+          <w:tcPr>
+            <w:tcW w:type="dxa" w:w="2160"/>
+          </w:tcPr>
+          <w:p>
+            <w:r/>
+            <w:r>
+              <w:rPr>
+                <w:sz w:val="17"/>
+              </w:rPr>
+              <w:t>48</w:t>
+            </w:r>
+          </w:p>
+        </w:tc>
+      </w:tr>
+      <w:tr>
+        <w:tc>
+          <w:tcPr>
+            <w:tcW w:type="dxa" w:w="2160"/>
+          </w:tcPr>
+          <w:p>
+            <w:r/>
+            <w:r>
+              <w:rPr>
+                <w:sz w:val="17"/>
+              </w:rPr>
+              <w:t>PD: trained elsewhere, test New Mexico</w:t>
+            </w:r>
+          </w:p>
+        </w:tc>
+        <w:tc>
+          <w:tcPr>
+            <w:tcW w:type="dxa" w:w="2160"/>
+          </w:tcPr>
+          <w:p>
+            <w:r/>
+            <w:r>
+              <w:rPr>
+                <w:sz w:val="17"/>
+              </w:rPr>
+              <w:t>0.741 [0.56, 0.88]</w:t>
+            </w:r>
+          </w:p>
+        </w:tc>
+        <w:tc>
+          <w:tcPr>
+            <w:tcW w:type="dxa" w:w="2160"/>
+          </w:tcPr>
+          <w:p>
+            <w:r/>
+            <w:r>
+              <w:rPr>
+                <w:sz w:val="17"/>
+              </w:rPr>
+              <w:t>23</w:t>
+            </w:r>
+          </w:p>
+        </w:tc>
+        <w:tc>
+          <w:tcPr>
+            <w:tcW w:type="dxa" w:w="2160"/>
+          </w:tcPr>
+          <w:p>
+            <w:r/>
+            <w:r>
+              <w:rPr>
+                <w:sz w:val="17"/>
+              </w:rPr>
+              <w:t>21</w:t>
+            </w:r>
+          </w:p>
+        </w:tc>
+      </w:tr>
+      <w:tr>
+        <w:tc>
+          <w:tcPr>
+            <w:tcW w:type="dxa" w:w="2160"/>
+          </w:tcPr>
+          <w:p>
+            <w:r/>
+            <w:r>
+              <w:rPr>
+                <w:sz w:val="17"/>
+              </w:rPr>
+              <w:t>PD: trained elsewhere, test San Diego</w:t>
+            </w:r>
+          </w:p>
+        </w:tc>
+        <w:tc>
+          <w:tcPr>
+            <w:tcW w:type="dxa" w:w="2160"/>
+          </w:tcPr>
+          <w:p>
+            <w:r/>
+            <w:r>
+              <w:rPr>
+                <w:sz w:val="17"/>
+              </w:rPr>
+              <w:t>0.783 [0.59, 0.94]</w:t>
+            </w:r>
+          </w:p>
+        </w:tc>
+        <w:tc>
+          <w:tcPr>
+            <w:tcW w:type="dxa" w:w="2160"/>
+          </w:tcPr>
+          <w:p>
+            <w:r/>
+            <w:r>
+              <w:rPr>
+                <w:sz w:val="17"/>
+              </w:rPr>
+              <w:t>15</w:t>
+            </w:r>
+          </w:p>
+        </w:tc>
+        <w:tc>
+          <w:tcPr>
+            <w:tcW w:type="dxa" w:w="2160"/>
+          </w:tcPr>
+          <w:p>
+            <w:r/>
+            <w:r>
+              <w:rPr>
+                <w:sz w:val="17"/>
+              </w:rPr>
+              <w:t>16</w:t>
+            </w:r>
+          </w:p>
+        </w:tc>
+      </w:tr>
+    </w:tbl>
+    <w:p>
+      <w:r>
+        <w:rPr>
+          <w:i/>
+          <w:color w:val="52514E"/>
+          <w:sz w:val="16"/>
+        </w:rPr>
+        <w:t>'positive' and 'negative' are the two groups of each task: patients vs controls, and for AD vs FTD, Alzheimer's vs frontotemporal dementia.</w:t>
+      </w:r>
+    </w:p>
     <w:p/>
     <w:p>
       <w:pPr>
@@ -9206,6 +11592,22 @@
     </w:p>
     <w:p>
       <w:pPr>
+        <w:pStyle w:val="ListBullet"/>
+      </w:pPr>
+      <w:r>
+        <w:t>Neurological results come from single hospitals for Alzheimer's and frontotemporal dementia (no second open dataset with controls was found), from older patients than the psychiatric sets, and for Parkinson's from eyes-open recordings. None of these probabilities is comparable with the psychiatric models'. The San Diego Parkinson's authors ask to be contacted before a manuscript using their data is submitted.</w:t>
+      </w:r>
+    </w:p>
+    <w:p>
+      <w:pPr>
+        <w:pStyle w:val="ListBullet"/>
+      </w:pPr>
+      <w:r>
+        <w:t>Parkinson's recordings are eyes-open, so they contain blinks, and a reduced spontaneous blink rate is itself a clinical sign of Parkinson's. Blink activity reaches the model through frontal slow-wave power and coherence, so part of any Parkinson's result may reflect blinking rather than cortical rhythms; an ablation without the frontal-pole electrodes would test this.</w:t>
+      </w:r>
+    </w:p>
+    <w:p>
+      <w:pPr>
         <w:pStyle w:val="Heading1"/>
       </w:pPr>
       <w:r>
@@ -9226,9 +11628,13 @@
         <w:br/>
         <w:t>python infer_channel_order.py                        # ASEEG channel order</w:t>
         <w:br/>
+        <w:t>python fetch_neuro.py                                # Alzheimer's/FTD/Parkinson's data (CC0)</w:t>
+        <w:br/>
         <w:t>python raw_eeg.py features</w:t>
         <w:br/>
         <w:t>python raw_eeg.py run --disease schizophrenia | mood</w:t>
+        <w:br/>
+        <w:t>python raw_eeg.py run --disease alzheimers | ftd | alzheimers_vs_ftd | parkinsons</w:t>
         <w:br/>
         <w:t>python make_report.py                                # this document</w:t>
       </w:r>

</xml_diff>